<commit_message>
Add original templates and interface screenshots
</commit_message>
<xml_diff>
--- a/templates/crew_change_template.docx
+++ b/templates/crew_change_template.docx
@@ -35,7 +35,7 @@
           <w:szCs w:val="36"/>
           <w:lang w:val="en-US" w:eastAsia="zh-CN" w:bidi="ar"/>
         </w:rPr>
-        <w:t>“DEMO SHIP</w:t>
+        <w:t>“CMA CGM AFRICA</w:t>
       </w:r>
       <w:r>
         <w:rPr>
@@ -74,7 +74,7 @@
           <w:szCs w:val="36"/>
           <w:lang w:val="en-US" w:eastAsia="zh-CN" w:bidi="ar"/>
         </w:rPr>
-        <w:t>示例船</w:t>
+        <w:t>达飞非洲四号</w:t>
       </w:r>
       <w:r>
         <w:rPr>
@@ -475,7 +475,7 @@
                 <w:vertAlign w:val="baseline"/>
                 <w:lang w:val="en-US" w:eastAsia="zh-CN" w:bidi="ar"/>
               </w:rPr>
-              <w:t>DEMO SHIP</w:t>
+              <w:t>CMA CGM AFRICA FOUR</w:t>
             </w:r>
             <w:r>
               <w:rPr>
@@ -526,7 +526,7 @@
                 <w:vertAlign w:val="baseline"/>
                 <w:lang w:val="en-US" w:eastAsia="zh-CN" w:bidi="ar"/>
               </w:rPr>
-              <w:t>示例船</w:t>
+              <w:t>达飞非洲四号</w:t>
             </w:r>
           </w:p>
         </w:tc>
@@ -574,7 +574,7 @@
                 <w:szCs w:val="28"/>
                 <w:lang w:val="en-US" w:eastAsia="zh-CN" w:bidi="ar"/>
               </w:rPr>
-              <w:t>1234567</w:t>
+              <w:t>4582876</w:t>
             </w:r>
           </w:p>
         </w:tc>
@@ -2312,7 +2312,7 @@
                 <w:szCs w:val="24"/>
                 <w:lang w:val="en-US" w:eastAsia="zh-CN" w:bidi="ar"/>
               </w:rPr>
-              <w:t>TEST0001</w:t>
+              <w:t>MI705580</w:t>
             </w:r>
           </w:p>
         </w:tc>
@@ -3816,7 +3816,7 @@
                 <w:szCs w:val="24"/>
                 <w:lang w:val="en-US" w:eastAsia="zh-CN" w:bidi="ar"/>
               </w:rPr>
-              <w:t>TEST0001</w:t>
+              <w:t>MI705580</w:t>
             </w:r>
           </w:p>
         </w:tc>

</xml_diff>

<commit_message>
Fix form exports and preserve customs logo
</commit_message>
<xml_diff>
--- a/templates/crew_change_template.docx
+++ b/templates/crew_change_template.docx
@@ -35,7 +35,7 @@
           <w:szCs w:val="36"/>
           <w:lang w:val="en-US" w:eastAsia="zh-CN" w:bidi="ar"/>
         </w:rPr>
-        <w:t>“CMA CGM AFRICA</w:t>
+        <w:t>“DEMO SHIP</w:t>
       </w:r>
       <w:r>
         <w:rPr>
@@ -74,7 +74,7 @@
           <w:szCs w:val="36"/>
           <w:lang w:val="en-US" w:eastAsia="zh-CN" w:bidi="ar"/>
         </w:rPr>
-        <w:t>达飞非洲四号</w:t>
+        <w:t>示例船</w:t>
       </w:r>
       <w:r>
         <w:rPr>
@@ -475,7 +475,7 @@
                 <w:vertAlign w:val="baseline"/>
                 <w:lang w:val="en-US" w:eastAsia="zh-CN" w:bidi="ar"/>
               </w:rPr>
-              <w:t>CMA CGM AFRICA FOUR</w:t>
+              <w:t>DEMO SHIP</w:t>
             </w:r>
             <w:r>
               <w:rPr>
@@ -526,7 +526,7 @@
                 <w:vertAlign w:val="baseline"/>
                 <w:lang w:val="en-US" w:eastAsia="zh-CN" w:bidi="ar"/>
               </w:rPr>
-              <w:t>达飞非洲四号</w:t>
+              <w:t>示例船</w:t>
             </w:r>
           </w:p>
         </w:tc>
@@ -574,7 +574,7 @@
                 <w:szCs w:val="28"/>
                 <w:lang w:val="en-US" w:eastAsia="zh-CN" w:bidi="ar"/>
               </w:rPr>
-              <w:t>4582876</w:t>
+              <w:t>1234567</w:t>
             </w:r>
           </w:p>
         </w:tc>
@@ -2312,7 +2312,7 @@
                 <w:szCs w:val="24"/>
                 <w:lang w:val="en-US" w:eastAsia="zh-CN" w:bidi="ar"/>
               </w:rPr>
-              <w:t>MI705580</w:t>
+              <w:t>TEST0001</w:t>
             </w:r>
           </w:p>
         </w:tc>
@@ -3816,7 +3816,7 @@
                 <w:szCs w:val="24"/>
                 <w:lang w:val="en-US" w:eastAsia="zh-CN" w:bidi="ar"/>
               </w:rPr>
-              <w:t>MI705580</w:t>
+              <w:t>TEST0001</w:t>
             </w:r>
           </w:p>
         </w:tc>

</xml_diff>